<commit_message>
John Sadler backlog blogs: full review pass, fix orphaned post references and unverified claims
Co-Authored-By: Claude Opus 5.5 <noreply@anthropic.com>
</commit_message>
<xml_diff>
--- a/clients/john-sadler/blogs/2025-backlog/01-ac-not-blowing-cold-air.docx
+++ b/clients/john-sadler/blogs/2025-backlog/01-ac-not-blowing-cold-air.docx
@@ -106,7 +106,7 @@
         <w:t>Quick Answer (Preformatted block):</w:t>
       </w:r>
       <w:r>
-        <w:t xml:space="preserve"> When your AC is not blowing cold air, the cause is usually a thermostat setting, a dirty air filter, a tripped breaker or a dirty outdoor unit, and you can check all four yourself in about 15 minutes. If those all look fine, or you see ice on the lines, the problem is more likely a frozen coil, a refrigerant leak or a failing electrical part, and that needs a licensed technician.</w:t>
+        <w:t xml:space="preserve"> When your AC is not blowing cold air, the cause is usually a thermostat setting, a dirty air filter, a tripped breaker or a dirty outdoor unit, and you can safely check all four yourself. If those all look fine, or you see ice on the lines, the problem is more likely a frozen coil, a refrigerant leak or a failing electrical part, and that needs a licensed technician.</w:t>
       </w:r>
     </w:p>
     <w:p>
@@ -129,7 +129,7 @@
     </w:p>
     <w:p>
       <w:r>
-        <w:t>It's the first hot afternoon of the year, the system is humming away, and the air from the vents feels the same as the air in the room. If you're asking "why is my AC not blowing cold air?", you're in good company: it's one of the most common summer calls in the Lower Mainland. This guide covers central air conditioners and heat pumps in cooling mode, since many homes in Surrey, Langley and White Rock now use a heat pump for both heating and cooling. We'll walk through the usual causes, the checks that are safe to do yourself, and when to call a licensed technician. John Sadler Plumbing &amp; Heating has served South Surrey and the surrounding area for 50 years, and these are the same checks our technicians start with.</w:t>
+        <w:t>It's the first hot afternoon of the year, the system is humming away, and the air from the vents feels the same as the air in the room. If you're asking "why is my AC not blowing cold air?", the good news is that the cause is often something simple you can check yourself. This guide covers central air conditioners and heat pumps in cooling mode, since many homes in Surrey, Langley and White Rock now use a heat pump for both heating and cooling. We'll walk through the usual causes, the checks that are safe to do yourself, and when to call a licensed technician. John Sadler Plumbing &amp; Heating has served South Surrey and the surrounding area for 50 years, and these are the same checks our licensed technicians start with on a service call.</w:t>
       </w:r>
     </w:p>
     <w:p>
@@ -860,10 +860,10 @@
         <w:rPr>
           <w:b/>
         </w:rPr>
-        <w:t>External links (2), both verified loading 2026-10-15:</w:t>
+        <w:t>External link (1), verified loading 2026-10-15:</w:t>
       </w:r>
       <w:r>
-        <w:t xml:space="preserve"> BC Laws, Ozone Depleting Substances and Other Halocarbons Regulation (B.C. Reg. 387/99, s. 7(1) and the "approved person" definition in s. 1); [Removed in review 2026-10-15: BC Coroners heat dome death statistics, to avoid fear-based framing per client's no-urgency rule. External links now 1.] Open both in a new tab with rel="noopener noreferrer" (the `{target=...}` markup is a placeholder for the WordPress editor).</w:t>
+        <w:t xml:space="preserve"> BC Laws, Ozone Depleting Substances and Other Halocarbons Regulation (B.C. Reg. 387/99, s. 7(1) and the "approved person" definition in s. 1). Open in a new tab with rel="noopener noreferrer". The BC Coroners heat dome death statistics were removed in review (2026-10-16) to avoid fear-based framing under the client's no-urgency rule.</w:t>
       </w:r>
     </w:p>
     <w:p>

</xml_diff>